<commit_message>
Fix: Unified template to reference.docx, fixed pathing for Vercel, and optimized image regex
</commit_message>
<xml_diff>
--- a/reference.docx
+++ b/reference.docx
@@ -3,18 +3,11 @@
 <w:document xmlns:wpc="http://schemas.microsoft.com/office/word/2010/wordprocessingCanvas" xmlns:cx="http://schemas.microsoft.com/office/drawing/2014/chartex" xmlns:cx1="http://schemas.microsoft.com/office/drawing/2015/9/8/chartex" xmlns:cx2="http://schemas.microsoft.com/office/drawing/2015/10/21/chartex" xmlns:cx3="http://schemas.microsoft.com/office/drawing/2016/5/9/chartex" xmlns:cx4="http://schemas.microsoft.com/office/drawing/2016/5/10/chartex" xmlns:cx5="http://schemas.microsoft.com/office/drawing/2016/5/11/chartex" xmlns:cx6="http://schemas.microsoft.com/office/drawing/2016/5/12/chartex" xmlns:cx7="http://schemas.microsoft.com/office/drawing/2016/5/13/chartex" xmlns:cx8="http://schemas.microsoft.com/office/drawing/2016/5/14/chartex" xmlns:mc="http://schemas.openxmlformats.org/markup-compatibility/2006" xmlns:aink="http://schemas.microsoft.com/office/drawing/2016/ink" xmlns:am3d="http://schemas.microsoft.com/office/drawing/2017/model3d" xmlns:o="urn:schemas-microsoft-com:office:office" xmlns:oel="http://schemas.microsoft.com/office/2019/extlst" xmlns:r="http://schemas.openxmlformats.org/officeDocument/2006/relationships" xmlns:m="http://schemas.openxmlformats.org/officeDocument/2006/math" xmlns:v="urn:schemas-microsoft-com:vml" xmlns:wp14="http://schemas.microsoft.com/office/word/2010/wordprocessingDrawing" xmlns:wp="http://schemas.openxmlformats.org/drawingml/2006/wordprocessingDrawing" xmlns:w10="urn:schemas-microsoft-com:office:word" xmlns:w="http://schemas.openxmlformats.org/wordprocessingml/2006/main" xmlns:w14="http://schemas.microsoft.com/office/word/2010/wordml" xmlns:w15="http://schemas.microsoft.com/office/word/2012/wordml" xmlns:w16cex="http://schemas.microsoft.com/office/word/2018/wordml/cex" xmlns:w16cid="http://schemas.microsoft.com/office/word/2016/wordml/cid" xmlns:w16="http://schemas.microsoft.com/office/word/2018/wordml" xmlns:w16sdtdh="http://schemas.microsoft.com/office/word/2020/wordml/sdtdatahash" xmlns:w16se="http://schemas.microsoft.com/office/word/2015/wordml/symex" xmlns:wpg="http://schemas.microsoft.com/office/word/2010/wordprocessingGroup" xmlns:wpi="http://schemas.microsoft.com/office/word/2010/wordprocessingInk" xmlns:wne="http://schemas.microsoft.com/office/word/2006/wordml" xmlns:wps="http://schemas.microsoft.com/office/word/2010/wordprocessingShape" mc:Ignorable="w14 w15 w16se w16cid w16 w16cex w16sdtdh wp14">
   <w:body>
     <w:p>
-      <w:pPr>
-        <w:rPr>
-          <w:sz w:val="24"/>
-          <w:szCs w:val="24"/>
-        </w:rPr>
-      </w:pPr>
       <w:r>
-        <w:rPr>
-          <w:sz w:val="24"/>
-          <w:szCs w:val="24"/>
-        </w:rPr>
         <w:t>[NOI_DUNG_CHINH]</w:t>
+      </w:r>
+      <w:r>
+        <w:br/>
       </w:r>
     </w:p>
     <w:sectPr>
@@ -682,6 +675,10 @@
   <w:style w:type="paragraph" w:default="1" w:styleId="Normal">
     <w:name w:val="Normal"/>
     <w:qFormat/>
+    <w:rsid w:val="007B5D45"/>
+    <w:rPr>
+      <w:sz w:val="26"/>
+    </w:rPr>
   </w:style>
   <w:style w:type="paragraph" w:styleId="Heading1">
     <w:name w:val="heading 1"/>
@@ -776,6 +773,7 @@
   <w:style w:type="character" w:default="1" w:styleId="DefaultParagraphFont">
     <w:name w:val="Default Paragraph Font"/>
     <w:uiPriority w:val="1"/>
+    <w:semiHidden/>
     <w:unhideWhenUsed/>
   </w:style>
   <w:style w:type="table" w:default="1" w:styleId="TableNormal">
@@ -940,6 +938,35 @@
     <w:link w:val="Footer"/>
     <w:uiPriority w:val="99"/>
     <w:rsid w:val="002B7E89"/>
+  </w:style>
+  <w:style w:type="table" w:styleId="TableGrid">
+    <w:name w:val="Table Grid"/>
+    <w:basedOn w:val="TableNormal"/>
+    <w:uiPriority w:val="39"/>
+    <w:rsid w:val="005B1269"/>
+    <w:pPr>
+      <w:spacing w:before="0" w:after="0" w:line="240" w:lineRule="auto"/>
+    </w:pPr>
+    <w:rPr>
+      <w:sz w:val="24"/>
+    </w:rPr>
+    <w:tblPr>
+      <w:jc w:val="center"/>
+      <w:tblBorders>
+        <w:top w:val="single" w:sz="4" w:space="0" w:color="auto"/>
+        <w:left w:val="single" w:sz="4" w:space="0" w:color="auto"/>
+        <w:bottom w:val="single" w:sz="4" w:space="0" w:color="auto"/>
+        <w:right w:val="single" w:sz="4" w:space="0" w:color="auto"/>
+        <w:insideH w:val="single" w:sz="4" w:space="0" w:color="auto"/>
+        <w:insideV w:val="single" w:sz="4" w:space="0" w:color="auto"/>
+      </w:tblBorders>
+    </w:tblPr>
+    <w:trPr>
+      <w:jc w:val="center"/>
+    </w:trPr>
+    <w:tcPr>
+      <w:vAlign w:val="center"/>
+    </w:tcPr>
   </w:style>
 </w:styles>
 </file>

</xml_diff>

<commit_message>
Update: Latest reference template (empty.docx)
</commit_message>
<xml_diff>
--- a/reference.docx
+++ b/reference.docx
@@ -5,9 +5,6 @@
     <w:p>
       <w:r>
         <w:t>[NOI_DUNG_CHINH]</w:t>
-      </w:r>
-      <w:r>
-        <w:br/>
       </w:r>
     </w:p>
     <w:sectPr>
@@ -968,6 +965,28 @@
       <w:vAlign w:val="center"/>
     </w:tcPr>
   </w:style>
+  <w:style w:type="table" w:customStyle="1" w:styleId="Style1">
+    <w:name w:val="Style1"/>
+    <w:basedOn w:val="TableNormal"/>
+    <w:uiPriority w:val="99"/>
+    <w:rsid w:val="005E7A14"/>
+    <w:pPr>
+      <w:spacing w:before="0" w:after="0" w:line="240" w:lineRule="auto"/>
+    </w:pPr>
+    <w:rPr>
+      <w:sz w:val="26"/>
+    </w:rPr>
+    <w:tblPr>
+      <w:tblBorders>
+        <w:top w:val="single" w:sz="4" w:space="0" w:color="auto"/>
+        <w:left w:val="single" w:sz="4" w:space="0" w:color="auto"/>
+        <w:bottom w:val="single" w:sz="4" w:space="0" w:color="auto"/>
+        <w:right w:val="single" w:sz="4" w:space="0" w:color="auto"/>
+        <w:insideH w:val="single" w:sz="4" w:space="0" w:color="auto"/>
+        <w:insideV w:val="single" w:sz="4" w:space="0" w:color="auto"/>
+      </w:tblBorders>
+    </w:tblPr>
+  </w:style>
 </w:styles>
 </file>
 

</xml_diff>

<commit_message>
Update: Latest revision of template_pandoc.docx
</commit_message>
<xml_diff>
--- a/reference.docx
+++ b/reference.docx
@@ -226,13 +226,124 @@
       </w:r>
     </w:p>
     <w:sectPr>
+      <w:headerReference w:type="default" r:id="rId8"/>
+      <w:footerReference w:type="default" r:id="rId9"/>
       <w:pgSz w:w="12240" w:h="15840"/>
-      <w:pgMar w:top="1134" w:right="1134" w:bottom="1134" w:left="1134" w:header="720" w:footer="720" w:gutter="0"/>
+      <w:pgMar w:top="431" w:right="1134" w:bottom="1418" w:left="1134" w:header="720" w:footer="227" w:gutter="0"/>
       <w:cols w:space="720"/>
       <w:docGrid w:linePitch="360"/>
     </w:sectPr>
   </w:body>
 </w:document>
+</file>
+
+<file path=word/endnotes.xml><?xml version="1.0" encoding="utf-8"?>
+<w:endnotes xmlns:wpc="http://schemas.microsoft.com/office/word/2010/wordprocessingCanvas" xmlns:cx="http://schemas.microsoft.com/office/drawing/2014/chartex" xmlns:cx1="http://schemas.microsoft.com/office/drawing/2015/9/8/chartex" xmlns:cx2="http://schemas.microsoft.com/office/drawing/2015/10/21/chartex" xmlns:cx3="http://schemas.microsoft.com/office/drawing/2016/5/9/chartex" xmlns:cx4="http://schemas.microsoft.com/office/drawing/2016/5/10/chartex" xmlns:cx5="http://schemas.microsoft.com/office/drawing/2016/5/11/chartex" xmlns:cx6="http://schemas.microsoft.com/office/drawing/2016/5/12/chartex" xmlns:cx7="http://schemas.microsoft.com/office/drawing/2016/5/13/chartex" xmlns:cx8="http://schemas.microsoft.com/office/drawing/2016/5/14/chartex" xmlns:mc="http://schemas.openxmlformats.org/markup-compatibility/2006" xmlns:aink="http://schemas.microsoft.com/office/drawing/2016/ink" xmlns:am3d="http://schemas.microsoft.com/office/drawing/2017/model3d" xmlns:o="urn:schemas-microsoft-com:office:office" xmlns:oel="http://schemas.microsoft.com/office/2019/extlst" xmlns:r="http://schemas.openxmlformats.org/officeDocument/2006/relationships" xmlns:m="http://schemas.openxmlformats.org/officeDocument/2006/math" xmlns:v="urn:schemas-microsoft-com:vml" xmlns:wp14="http://schemas.microsoft.com/office/word/2010/wordprocessingDrawing" xmlns:wp="http://schemas.openxmlformats.org/drawingml/2006/wordprocessingDrawing" xmlns:w10="urn:schemas-microsoft-com:office:word" xmlns:w="http://schemas.openxmlformats.org/wordprocessingml/2006/main" xmlns:w14="http://schemas.microsoft.com/office/word/2010/wordml" xmlns:w15="http://schemas.microsoft.com/office/word/2012/wordml" xmlns:w16cex="http://schemas.microsoft.com/office/word/2018/wordml/cex" xmlns:w16cid="http://schemas.microsoft.com/office/word/2016/wordml/cid" xmlns:w16="http://schemas.microsoft.com/office/word/2018/wordml" xmlns:w16sdtdh="http://schemas.microsoft.com/office/word/2020/wordml/sdtdatahash" xmlns:w16se="http://schemas.microsoft.com/office/word/2015/wordml/symex" xmlns:wpg="http://schemas.microsoft.com/office/word/2010/wordprocessingGroup" xmlns:wpi="http://schemas.microsoft.com/office/word/2010/wordprocessingInk" xmlns:wne="http://schemas.microsoft.com/office/word/2006/wordml" xmlns:wps="http://schemas.microsoft.com/office/word/2010/wordprocessingShape" mc:Ignorable="w14 w15 w16se w16cid w16 w16cex w16sdtdh wp14">
+  <w:endnote w:type="separator" w:id="-1">
+    <w:p>
+      <w:r>
+        <w:separator/>
+      </w:r>
+    </w:p>
+  </w:endnote>
+  <w:endnote w:type="continuationSeparator" w:id="0">
+    <w:p>
+      <w:r>
+        <w:continuationSeparator/>
+      </w:r>
+    </w:p>
+  </w:endnote>
+</w:endnotes>
+</file>
+
+<file path=word/footer1.xml><?xml version="1.0" encoding="utf-8"?>
+<w:ftr xmlns:wpc="http://schemas.microsoft.com/office/word/2010/wordprocessingCanvas" xmlns:cx="http://schemas.microsoft.com/office/drawing/2014/chartex" xmlns:cx1="http://schemas.microsoft.com/office/drawing/2015/9/8/chartex" xmlns:cx2="http://schemas.microsoft.com/office/drawing/2015/10/21/chartex" xmlns:cx3="http://schemas.microsoft.com/office/drawing/2016/5/9/chartex" xmlns:cx4="http://schemas.microsoft.com/office/drawing/2016/5/10/chartex" xmlns:cx5="http://schemas.microsoft.com/office/drawing/2016/5/11/chartex" xmlns:cx6="http://schemas.microsoft.com/office/drawing/2016/5/12/chartex" xmlns:cx7="http://schemas.microsoft.com/office/drawing/2016/5/13/chartex" xmlns:cx8="http://schemas.microsoft.com/office/drawing/2016/5/14/chartex" xmlns:mc="http://schemas.openxmlformats.org/markup-compatibility/2006" xmlns:aink="http://schemas.microsoft.com/office/drawing/2016/ink" xmlns:am3d="http://schemas.microsoft.com/office/drawing/2017/model3d" xmlns:o="urn:schemas-microsoft-com:office:office" xmlns:oel="http://schemas.microsoft.com/office/2019/extlst" xmlns:r="http://schemas.openxmlformats.org/officeDocument/2006/relationships" xmlns:m="http://schemas.openxmlformats.org/officeDocument/2006/math" xmlns:v="urn:schemas-microsoft-com:vml" xmlns:wp14="http://schemas.microsoft.com/office/word/2010/wordprocessingDrawing" xmlns:wp="http://schemas.openxmlformats.org/drawingml/2006/wordprocessingDrawing" xmlns:w10="urn:schemas-microsoft-com:office:word" xmlns:w="http://schemas.openxmlformats.org/wordprocessingml/2006/main" xmlns:w14="http://schemas.microsoft.com/office/word/2010/wordml" xmlns:w15="http://schemas.microsoft.com/office/word/2012/wordml" xmlns:w16cex="http://schemas.microsoft.com/office/word/2018/wordml/cex" xmlns:w16cid="http://schemas.microsoft.com/office/word/2016/wordml/cid" xmlns:w16="http://schemas.microsoft.com/office/word/2018/wordml" xmlns:w16sdtdh="http://schemas.microsoft.com/office/word/2020/wordml/sdtdatahash" xmlns:w16se="http://schemas.microsoft.com/office/word/2015/wordml/symex" xmlns:wpg="http://schemas.microsoft.com/office/word/2010/wordprocessingGroup" xmlns:wpi="http://schemas.microsoft.com/office/word/2010/wordprocessingInk" xmlns:wne="http://schemas.microsoft.com/office/word/2006/wordml" xmlns:wps="http://schemas.microsoft.com/office/word/2010/wordprocessingShape" mc:Ignorable="w14 w15 w16se w16cid w16 w16cex w16sdtdh wp14">
+  <w:sdt>
+    <w:sdtPr>
+      <w:id w:val="2049337779"/>
+      <w:docPartObj>
+        <w:docPartGallery w:val="Page Numbers (Bottom of Page)"/>
+        <w:docPartUnique/>
+      </w:docPartObj>
+    </w:sdtPr>
+    <w:sdtEndPr>
+      <w:rPr>
+        <w:noProof/>
+      </w:rPr>
+    </w:sdtEndPr>
+    <w:sdtContent>
+      <w:p>
+        <w:pPr>
+          <w:pStyle w:val="Footer"/>
+          <w:jc w:val="center"/>
+        </w:pPr>
+        <w:r>
+          <w:fldChar w:fldCharType="begin"/>
+        </w:r>
+        <w:r>
+          <w:instrText xml:space="preserve"> PAGE   \* MERGEFORMAT </w:instrText>
+        </w:r>
+        <w:r>
+          <w:fldChar w:fldCharType="separate"/>
+        </w:r>
+        <w:r>
+          <w:rPr>
+            <w:noProof/>
+          </w:rPr>
+          <w:t>2</w:t>
+        </w:r>
+        <w:r>
+          <w:rPr>
+            <w:noProof/>
+          </w:rPr>
+          <w:fldChar w:fldCharType="end"/>
+        </w:r>
+      </w:p>
+    </w:sdtContent>
+  </w:sdt>
+  <w:p>
+    <w:pPr>
+      <w:pStyle w:val="Footer"/>
+    </w:pPr>
+  </w:p>
+</w:ftr>
+</file>
+
+<file path=word/footnotes.xml><?xml version="1.0" encoding="utf-8"?>
+<w:footnotes xmlns:wpc="http://schemas.microsoft.com/office/word/2010/wordprocessingCanvas" xmlns:cx="http://schemas.microsoft.com/office/drawing/2014/chartex" xmlns:cx1="http://schemas.microsoft.com/office/drawing/2015/9/8/chartex" xmlns:cx2="http://schemas.microsoft.com/office/drawing/2015/10/21/chartex" xmlns:cx3="http://schemas.microsoft.com/office/drawing/2016/5/9/chartex" xmlns:cx4="http://schemas.microsoft.com/office/drawing/2016/5/10/chartex" xmlns:cx5="http://schemas.microsoft.com/office/drawing/2016/5/11/chartex" xmlns:cx6="http://schemas.microsoft.com/office/drawing/2016/5/12/chartex" xmlns:cx7="http://schemas.microsoft.com/office/drawing/2016/5/13/chartex" xmlns:cx8="http://schemas.microsoft.com/office/drawing/2016/5/14/chartex" xmlns:mc="http://schemas.openxmlformats.org/markup-compatibility/2006" xmlns:aink="http://schemas.microsoft.com/office/drawing/2016/ink" xmlns:am3d="http://schemas.microsoft.com/office/drawing/2017/model3d" xmlns:o="urn:schemas-microsoft-com:office:office" xmlns:oel="http://schemas.microsoft.com/office/2019/extlst" xmlns:r="http://schemas.openxmlformats.org/officeDocument/2006/relationships" xmlns:m="http://schemas.openxmlformats.org/officeDocument/2006/math" xmlns:v="urn:schemas-microsoft-com:vml" xmlns:wp14="http://schemas.microsoft.com/office/word/2010/wordprocessingDrawing" xmlns:wp="http://schemas.openxmlformats.org/drawingml/2006/wordprocessingDrawing" xmlns:w10="urn:schemas-microsoft-com:office:word" xmlns:w="http://schemas.openxmlformats.org/wordprocessingml/2006/main" xmlns:w14="http://schemas.microsoft.com/office/word/2010/wordml" xmlns:w15="http://schemas.microsoft.com/office/word/2012/wordml" xmlns:w16cex="http://schemas.microsoft.com/office/word/2018/wordml/cex" xmlns:w16cid="http://schemas.microsoft.com/office/word/2016/wordml/cid" xmlns:w16="http://schemas.microsoft.com/office/word/2018/wordml" xmlns:w16sdtdh="http://schemas.microsoft.com/office/word/2020/wordml/sdtdatahash" xmlns:w16se="http://schemas.microsoft.com/office/word/2015/wordml/symex" xmlns:wpg="http://schemas.microsoft.com/office/word/2010/wordprocessingGroup" xmlns:wpi="http://schemas.microsoft.com/office/word/2010/wordprocessingInk" xmlns:wne="http://schemas.microsoft.com/office/word/2006/wordml" xmlns:wps="http://schemas.microsoft.com/office/word/2010/wordprocessingShape" mc:Ignorable="w14 w15 w16se w16cid w16 w16cex w16sdtdh wp14">
+  <w:footnote w:type="separator" w:id="-1">
+    <w:p>
+      <w:r>
+        <w:separator/>
+      </w:r>
+    </w:p>
+  </w:footnote>
+  <w:footnote w:type="continuationSeparator" w:id="0">
+    <w:p>
+      <w:r>
+        <w:continuationSeparator/>
+      </w:r>
+    </w:p>
+  </w:footnote>
+</w:footnotes>
+</file>
+
+<file path=word/header1.xml><?xml version="1.0" encoding="utf-8"?>
+<w:hdr xmlns:wpc="http://schemas.microsoft.com/office/word/2010/wordprocessingCanvas" xmlns:cx="http://schemas.microsoft.com/office/drawing/2014/chartex" xmlns:cx1="http://schemas.microsoft.com/office/drawing/2015/9/8/chartex" xmlns:cx2="http://schemas.microsoft.com/office/drawing/2015/10/21/chartex" xmlns:cx3="http://schemas.microsoft.com/office/drawing/2016/5/9/chartex" xmlns:cx4="http://schemas.microsoft.com/office/drawing/2016/5/10/chartex" xmlns:cx5="http://schemas.microsoft.com/office/drawing/2016/5/11/chartex" xmlns:cx6="http://schemas.microsoft.com/office/drawing/2016/5/12/chartex" xmlns:cx7="http://schemas.microsoft.com/office/drawing/2016/5/13/chartex" xmlns:cx8="http://schemas.microsoft.com/office/drawing/2016/5/14/chartex" xmlns:mc="http://schemas.openxmlformats.org/markup-compatibility/2006" xmlns:aink="http://schemas.microsoft.com/office/drawing/2016/ink" xmlns:am3d="http://schemas.microsoft.com/office/drawing/2017/model3d" xmlns:o="urn:schemas-microsoft-com:office:office" xmlns:oel="http://schemas.microsoft.com/office/2019/extlst" xmlns:r="http://schemas.openxmlformats.org/officeDocument/2006/relationships" xmlns:m="http://schemas.openxmlformats.org/officeDocument/2006/math" xmlns:v="urn:schemas-microsoft-com:vml" xmlns:wp14="http://schemas.microsoft.com/office/word/2010/wordprocessingDrawing" xmlns:wp="http://schemas.openxmlformats.org/drawingml/2006/wordprocessingDrawing" xmlns:w10="urn:schemas-microsoft-com:office:word" xmlns:w="http://schemas.openxmlformats.org/wordprocessingml/2006/main" xmlns:w14="http://schemas.microsoft.com/office/word/2010/wordml" xmlns:w15="http://schemas.microsoft.com/office/word/2012/wordml" xmlns:w16cex="http://schemas.microsoft.com/office/word/2018/wordml/cex" xmlns:w16cid="http://schemas.microsoft.com/office/word/2016/wordml/cid" xmlns:w16="http://schemas.microsoft.com/office/word/2018/wordml" xmlns:w16sdtdh="http://schemas.microsoft.com/office/word/2020/wordml/sdtdatahash" xmlns:w16se="http://schemas.microsoft.com/office/word/2015/wordml/symex" xmlns:wpg="http://schemas.microsoft.com/office/word/2010/wordprocessingGroup" xmlns:wpi="http://schemas.microsoft.com/office/word/2010/wordprocessingInk" xmlns:wne="http://schemas.microsoft.com/office/word/2006/wordml" xmlns:wps="http://schemas.microsoft.com/office/word/2010/wordprocessingShape" mc:Ignorable="w14 w15 w16se w16cid w16 w16cex w16sdtdh wp14">
+  <w:p>
+    <w:pPr>
+      <w:pStyle w:val="Header"/>
+      <w:tabs>
+        <w:tab w:val="clear" w:pos="4680"/>
+        <w:tab w:val="clear" w:pos="9360"/>
+        <w:tab w:val="left" w:pos="1328"/>
+      </w:tabs>
+    </w:pPr>
+    <w:r>
+      <w:tab/>
+    </w:r>
+  </w:p>
+</w:hdr>
 </file>
 
 <file path=word/numbering.xml><?xml version="1.0" encoding="utf-8"?>

</xml_diff>

<commit_message>
Update: Final edits to template_pandoc.docx
</commit_message>
<xml_diff>
--- a/reference.docx
+++ b/reference.docx
@@ -3,6 +3,9 @@
 <w:document xmlns:wpc="http://schemas.microsoft.com/office/word/2010/wordprocessingCanvas" xmlns:cx="http://schemas.microsoft.com/office/drawing/2014/chartex" xmlns:cx1="http://schemas.microsoft.com/office/drawing/2015/9/8/chartex" xmlns:cx2="http://schemas.microsoft.com/office/drawing/2015/10/21/chartex" xmlns:cx3="http://schemas.microsoft.com/office/drawing/2016/5/9/chartex" xmlns:cx4="http://schemas.microsoft.com/office/drawing/2016/5/10/chartex" xmlns:cx5="http://schemas.microsoft.com/office/drawing/2016/5/11/chartex" xmlns:cx6="http://schemas.microsoft.com/office/drawing/2016/5/12/chartex" xmlns:cx7="http://schemas.microsoft.com/office/drawing/2016/5/13/chartex" xmlns:cx8="http://schemas.microsoft.com/office/drawing/2016/5/14/chartex" xmlns:mc="http://schemas.openxmlformats.org/markup-compatibility/2006" xmlns:aink="http://schemas.microsoft.com/office/drawing/2016/ink" xmlns:am3d="http://schemas.microsoft.com/office/drawing/2017/model3d" xmlns:o="urn:schemas-microsoft-com:office:office" xmlns:oel="http://schemas.microsoft.com/office/2019/extlst" xmlns:r="http://schemas.openxmlformats.org/officeDocument/2006/relationships" xmlns:m="http://schemas.openxmlformats.org/officeDocument/2006/math" xmlns:v="urn:schemas-microsoft-com:vml" xmlns:wp14="http://schemas.microsoft.com/office/word/2010/wordprocessingDrawing" xmlns:wp="http://schemas.openxmlformats.org/drawingml/2006/wordprocessingDrawing" xmlns:w10="urn:schemas-microsoft-com:office:word" xmlns:w="http://schemas.openxmlformats.org/wordprocessingml/2006/main" xmlns:w14="http://schemas.microsoft.com/office/word/2010/wordml" xmlns:w15="http://schemas.microsoft.com/office/word/2012/wordml" xmlns:w16cex="http://schemas.microsoft.com/office/word/2018/wordml/cex" xmlns:w16cid="http://schemas.microsoft.com/office/word/2016/wordml/cid" xmlns:w16="http://schemas.microsoft.com/office/word/2018/wordml" xmlns:w16sdtdh="http://schemas.microsoft.com/office/word/2020/wordml/sdtdatahash" xmlns:w16se="http://schemas.microsoft.com/office/word/2015/wordml/symex" xmlns:wpg="http://schemas.microsoft.com/office/word/2010/wordprocessingGroup" xmlns:wpi="http://schemas.microsoft.com/office/word/2010/wordprocessingInk" xmlns:wne="http://schemas.microsoft.com/office/word/2006/wordml" xmlns:wps="http://schemas.microsoft.com/office/word/2010/wordprocessingShape" mc:Ignorable="w14 w15 w16se w16cid w16 w16cex w16sdtdh wp14">
   <w:body>
     <w:p>
+      <w:pPr>
+        <w:spacing w:line="360" w:lineRule="auto"/>
+      </w:pPr>
       <w:r>
         <w:rPr>
           <w:b/>
@@ -12,6 +15,9 @@
       </w:r>
     </w:p>
     <w:p>
+      <w:pPr>
+        <w:spacing w:line="360" w:lineRule="auto"/>
+      </w:pPr>
       <w:r>
         <w:t>Template này dùng để export Pandoc với bảng có border liền, spacing chuẩn và font Times New Roman.</w:t>
       </w:r>
@@ -20,26 +26,32 @@
       <w:tblPr>
         <w:tblStyle w:val="TableGrid"/>
         <w:tblW w:w="0" w:type="auto"/>
-        <w:jc w:val="center"/>
+        <w:tblBorders>
+          <w:top w:val="single" w:sz="12" w:space="0" w:color="auto"/>
+          <w:left w:val="single" w:sz="12" w:space="0" w:color="auto"/>
+          <w:bottom w:val="single" w:sz="12" w:space="0" w:color="auto"/>
+          <w:right w:val="single" w:sz="12" w:space="0" w:color="auto"/>
+          <w:insideH w:val="single" w:sz="12" w:space="0" w:color="auto"/>
+          <w:insideV w:val="single" w:sz="12" w:space="0" w:color="auto"/>
+        </w:tblBorders>
         <w:tblLook w:val="04A0" w:firstRow="1" w:lastRow="0" w:firstColumn="1" w:lastColumn="0" w:noHBand="0" w:noVBand="1"/>
       </w:tblPr>
       <w:tblGrid>
-        <w:gridCol w:w="1994"/>
-        <w:gridCol w:w="1994"/>
-        <w:gridCol w:w="1994"/>
-        <w:gridCol w:w="1994"/>
-        <w:gridCol w:w="1994"/>
+        <w:gridCol w:w="1990"/>
+        <w:gridCol w:w="1988"/>
+        <w:gridCol w:w="1988"/>
+        <w:gridCol w:w="1988"/>
+        <w:gridCol w:w="1988"/>
       </w:tblGrid>
       <w:tr>
-        <w:trPr>
-          <w:jc w:val="center"/>
-        </w:trPr>
         <w:tc>
           <w:tcPr>
             <w:tcW w:w="1994" w:type="dxa"/>
-            <w:vAlign w:val="center"/>
           </w:tcPr>
           <w:p>
+            <w:pPr>
+              <w:spacing w:line="360" w:lineRule="auto"/>
+            </w:pPr>
             <w:r>
               <w:t>Tháng</w:t>
             </w:r>
@@ -48,9 +60,11 @@
         <w:tc>
           <w:tcPr>
             <w:tcW w:w="1994" w:type="dxa"/>
-            <w:vAlign w:val="center"/>
           </w:tcPr>
           <w:p>
+            <w:pPr>
+              <w:spacing w:line="360" w:lineRule="auto"/>
+            </w:pPr>
             <w:r>
               <w:t>1</w:t>
             </w:r>
@@ -59,9 +73,11 @@
         <w:tc>
           <w:tcPr>
             <w:tcW w:w="1994" w:type="dxa"/>
-            <w:vAlign w:val="center"/>
           </w:tcPr>
           <w:p>
+            <w:pPr>
+              <w:spacing w:line="360" w:lineRule="auto"/>
+            </w:pPr>
             <w:r>
               <w:t>2</w:t>
             </w:r>
@@ -70,9 +86,11 @@
         <w:tc>
           <w:tcPr>
             <w:tcW w:w="1994" w:type="dxa"/>
-            <w:vAlign w:val="center"/>
           </w:tcPr>
           <w:p>
+            <w:pPr>
+              <w:spacing w:line="360" w:lineRule="auto"/>
+            </w:pPr>
             <w:r>
               <w:t>3</w:t>
             </w:r>
@@ -81,9 +99,11 @@
         <w:tc>
           <w:tcPr>
             <w:tcW w:w="1994" w:type="dxa"/>
-            <w:vAlign w:val="center"/>
           </w:tcPr>
           <w:p>
+            <w:pPr>
+              <w:spacing w:line="360" w:lineRule="auto"/>
+            </w:pPr>
             <w:r>
               <w:t>4</w:t>
             </w:r>
@@ -91,15 +111,14 @@
         </w:tc>
       </w:tr>
       <w:tr>
-        <w:trPr>
-          <w:jc w:val="center"/>
-        </w:trPr>
         <w:tc>
           <w:tcPr>
             <w:tcW w:w="1994" w:type="dxa"/>
-            <w:vAlign w:val="center"/>
           </w:tcPr>
           <w:p>
+            <w:pPr>
+              <w:spacing w:line="360" w:lineRule="auto"/>
+            </w:pPr>
             <w:r>
               <w:t>Hà Nội</w:t>
             </w:r>
@@ -108,9 +127,11 @@
         <w:tc>
           <w:tcPr>
             <w:tcW w:w="1994" w:type="dxa"/>
-            <w:vAlign w:val="center"/>
           </w:tcPr>
           <w:p>
+            <w:pPr>
+              <w:spacing w:line="360" w:lineRule="auto"/>
+            </w:pPr>
             <w:r>
               <w:t>19</w:t>
             </w:r>
@@ -119,9 +140,11 @@
         <w:tc>
           <w:tcPr>
             <w:tcW w:w="1994" w:type="dxa"/>
-            <w:vAlign w:val="center"/>
           </w:tcPr>
           <w:p>
+            <w:pPr>
+              <w:spacing w:line="360" w:lineRule="auto"/>
+            </w:pPr>
             <w:r>
               <w:t>26</w:t>
             </w:r>
@@ -130,9 +153,11 @@
         <w:tc>
           <w:tcPr>
             <w:tcW w:w="1994" w:type="dxa"/>
-            <w:vAlign w:val="center"/>
           </w:tcPr>
           <w:p>
+            <w:pPr>
+              <w:spacing w:line="360" w:lineRule="auto"/>
+            </w:pPr>
             <w:r>
               <w:t>44</w:t>
             </w:r>
@@ -141,9 +166,11 @@
         <w:tc>
           <w:tcPr>
             <w:tcW w:w="1994" w:type="dxa"/>
-            <w:vAlign w:val="center"/>
           </w:tcPr>
           <w:p>
+            <w:pPr>
+              <w:spacing w:line="360" w:lineRule="auto"/>
+            </w:pPr>
             <w:r>
               <w:t>90</w:t>
             </w:r>
@@ -151,15 +178,14 @@
         </w:tc>
       </w:tr>
       <w:tr>
-        <w:trPr>
-          <w:jc w:val="center"/>
-        </w:trPr>
         <w:tc>
           <w:tcPr>
             <w:tcW w:w="1994" w:type="dxa"/>
-            <w:vAlign w:val="center"/>
           </w:tcPr>
           <w:p>
+            <w:pPr>
+              <w:spacing w:line="360" w:lineRule="auto"/>
+            </w:pPr>
             <w:r>
               <w:t>TP.HCM</w:t>
             </w:r>
@@ -168,9 +194,11 @@
         <w:tc>
           <w:tcPr>
             <w:tcW w:w="1994" w:type="dxa"/>
-            <w:vAlign w:val="center"/>
           </w:tcPr>
           <w:p>
+            <w:pPr>
+              <w:spacing w:line="360" w:lineRule="auto"/>
+            </w:pPr>
             <w:r>
               <w:t>14</w:t>
             </w:r>
@@ -179,9 +207,11 @@
         <w:tc>
           <w:tcPr>
             <w:tcW w:w="1994" w:type="dxa"/>
-            <w:vAlign w:val="center"/>
           </w:tcPr>
           <w:p>
+            <w:pPr>
+              <w:spacing w:line="360" w:lineRule="auto"/>
+            </w:pPr>
             <w:r>
               <w:t>4</w:t>
             </w:r>
@@ -190,9 +220,11 @@
         <w:tc>
           <w:tcPr>
             <w:tcW w:w="1994" w:type="dxa"/>
-            <w:vAlign w:val="center"/>
           </w:tcPr>
           <w:p>
+            <w:pPr>
+              <w:spacing w:line="360" w:lineRule="auto"/>
+            </w:pPr>
             <w:r>
               <w:t>11</w:t>
             </w:r>
@@ -201,9 +233,11 @@
         <w:tc>
           <w:tcPr>
             <w:tcW w:w="1994" w:type="dxa"/>
-            <w:vAlign w:val="center"/>
           </w:tcPr>
           <w:p>
+            <w:pPr>
+              <w:spacing w:line="360" w:lineRule="auto"/>
+            </w:pPr>
             <w:r>
               <w:t>50</w:t>
             </w:r>
@@ -212,11 +246,17 @@
       </w:tr>
     </w:tbl>
     <w:p>
+      <w:pPr>
+        <w:spacing w:line="360" w:lineRule="auto"/>
+      </w:pPr>
       <w:r>
         <w:t>Dùng với lệnh:</w:t>
       </w:r>
     </w:p>
     <w:p>
+      <w:pPr>
+        <w:spacing w:line="360" w:lineRule="auto"/>
+      </w:pPr>
       <w:r>
         <w:rPr>
           <w:rFonts w:ascii="Courier New" w:hAnsi="Courier New"/>
@@ -1880,20 +1920,31 @@
     <w:name w:val="Table Grid"/>
     <w:basedOn w:val="TableNormal"/>
     <w:uiPriority w:val="59"/>
-    <w:rsid w:val="00FC693F"/>
+    <w:rsid w:val="00442247"/>
     <w:pPr>
       <w:spacing w:after="0" w:line="240" w:lineRule="auto"/>
     </w:pPr>
+    <w:rPr>
+      <w:rFonts w:ascii="Times New Roman" w:hAnsi="Times New Roman"/>
+      <w:sz w:val="26"/>
+    </w:rPr>
     <w:tblPr>
+      <w:jc w:val="center"/>
       <w:tblBorders>
-        <w:top w:val="single" w:sz="4" w:space="0" w:color="auto"/>
-        <w:left w:val="single" w:sz="4" w:space="0" w:color="auto"/>
-        <w:bottom w:val="single" w:sz="4" w:space="0" w:color="auto"/>
-        <w:right w:val="single" w:sz="4" w:space="0" w:color="auto"/>
-        <w:insideH w:val="single" w:sz="4" w:space="0" w:color="auto"/>
-        <w:insideV w:val="single" w:sz="4" w:space="0" w:color="auto"/>
+        <w:top w:val="single" w:sz="18" w:space="0" w:color="000000"/>
+        <w:left w:val="single" w:sz="18" w:space="0" w:color="000000"/>
+        <w:bottom w:val="single" w:sz="18" w:space="0" w:color="000000"/>
+        <w:right w:val="single" w:sz="18" w:space="0" w:color="000000"/>
+        <w:insideH w:val="single" w:sz="18" w:space="0" w:color="000000"/>
+        <w:insideV w:val="single" w:sz="18" w:space="0" w:color="000000"/>
       </w:tblBorders>
     </w:tblPr>
+    <w:trPr>
+      <w:jc w:val="center"/>
+    </w:trPr>
+    <w:tcPr>
+      <w:vAlign w:val="center"/>
+    </w:tcPr>
   </w:style>
   <w:style w:type="table" w:styleId="LightShading">
     <w:name w:val="Light Shading"/>

</xml_diff>

<commit_message>
Update: Recursive template update
</commit_message>
<xml_diff>
--- a/reference.docx
+++ b/reference.docx
@@ -5,6 +5,7 @@
     <w:p>
       <w:pPr>
         <w:spacing w:line="360" w:lineRule="auto"/>
+        <w:jc w:val="both"/>
       </w:pPr>
       <w:r>
         <w:rPr>
@@ -17,6 +18,7 @@
     <w:p>
       <w:pPr>
         <w:spacing w:line="360" w:lineRule="auto"/>
+        <w:jc w:val="both"/>
       </w:pPr>
       <w:r>
         <w:t>Template này dùng để export Pandoc với bảng có border liền, spacing chuẩn và font Times New Roman.</w:t>
@@ -51,6 +53,7 @@
           <w:p>
             <w:pPr>
               <w:spacing w:line="360" w:lineRule="auto"/>
+              <w:jc w:val="both"/>
             </w:pPr>
             <w:r>
               <w:t>Tháng</w:t>
@@ -64,6 +67,7 @@
           <w:p>
             <w:pPr>
               <w:spacing w:line="360" w:lineRule="auto"/>
+              <w:jc w:val="both"/>
             </w:pPr>
             <w:r>
               <w:t>1</w:t>
@@ -77,6 +81,7 @@
           <w:p>
             <w:pPr>
               <w:spacing w:line="360" w:lineRule="auto"/>
+              <w:jc w:val="both"/>
             </w:pPr>
             <w:r>
               <w:t>2</w:t>
@@ -90,6 +95,7 @@
           <w:p>
             <w:pPr>
               <w:spacing w:line="360" w:lineRule="auto"/>
+              <w:jc w:val="both"/>
             </w:pPr>
             <w:r>
               <w:t>3</w:t>
@@ -103,6 +109,7 @@
           <w:p>
             <w:pPr>
               <w:spacing w:line="360" w:lineRule="auto"/>
+              <w:jc w:val="both"/>
             </w:pPr>
             <w:r>
               <w:t>4</w:t>
@@ -118,6 +125,7 @@
           <w:p>
             <w:pPr>
               <w:spacing w:line="360" w:lineRule="auto"/>
+              <w:jc w:val="both"/>
             </w:pPr>
             <w:r>
               <w:t>Hà Nội</w:t>
@@ -131,6 +139,7 @@
           <w:p>
             <w:pPr>
               <w:spacing w:line="360" w:lineRule="auto"/>
+              <w:jc w:val="both"/>
             </w:pPr>
             <w:r>
               <w:t>19</w:t>
@@ -144,6 +153,7 @@
           <w:p>
             <w:pPr>
               <w:spacing w:line="360" w:lineRule="auto"/>
+              <w:jc w:val="both"/>
             </w:pPr>
             <w:r>
               <w:t>26</w:t>
@@ -157,6 +167,7 @@
           <w:p>
             <w:pPr>
               <w:spacing w:line="360" w:lineRule="auto"/>
+              <w:jc w:val="both"/>
             </w:pPr>
             <w:r>
               <w:t>44</w:t>
@@ -170,6 +181,7 @@
           <w:p>
             <w:pPr>
               <w:spacing w:line="360" w:lineRule="auto"/>
+              <w:jc w:val="both"/>
             </w:pPr>
             <w:r>
               <w:t>90</w:t>
@@ -185,6 +197,7 @@
           <w:p>
             <w:pPr>
               <w:spacing w:line="360" w:lineRule="auto"/>
+              <w:jc w:val="both"/>
             </w:pPr>
             <w:r>
               <w:t>TP.HCM</w:t>
@@ -198,6 +211,7 @@
           <w:p>
             <w:pPr>
               <w:spacing w:line="360" w:lineRule="auto"/>
+              <w:jc w:val="both"/>
             </w:pPr>
             <w:r>
               <w:t>14</w:t>
@@ -211,6 +225,7 @@
           <w:p>
             <w:pPr>
               <w:spacing w:line="360" w:lineRule="auto"/>
+              <w:jc w:val="both"/>
             </w:pPr>
             <w:r>
               <w:t>4</w:t>
@@ -224,6 +239,7 @@
           <w:p>
             <w:pPr>
               <w:spacing w:line="360" w:lineRule="auto"/>
+              <w:jc w:val="both"/>
             </w:pPr>
             <w:r>
               <w:t>11</w:t>
@@ -237,6 +253,7 @@
           <w:p>
             <w:pPr>
               <w:spacing w:line="360" w:lineRule="auto"/>
+              <w:jc w:val="both"/>
             </w:pPr>
             <w:r>
               <w:t>50</w:t>
@@ -248,6 +265,7 @@
     <w:p>
       <w:pPr>
         <w:spacing w:line="360" w:lineRule="auto"/>
+        <w:jc w:val="both"/>
       </w:pPr>
       <w:r>
         <w:t>Dùng với lệnh:</w:t>
@@ -256,6 +274,7 @@
     <w:p>
       <w:pPr>
         <w:spacing w:line="360" w:lineRule="auto"/>
+        <w:jc w:val="both"/>
       </w:pPr>
       <w:r>
         <w:rPr>

</xml_diff>

<commit_message>
Update: Switch to template_pandoc_center.docx
</commit_message>
<xml_diff>
--- a/reference.docx
+++ b/reference.docx
@@ -4,8 +4,7 @@
   <w:body>
     <w:p>
       <w:pPr>
-        <w:spacing w:line="360" w:lineRule="auto"/>
-        <w:jc w:val="both"/>
+        <w:jc w:val="center"/>
       </w:pPr>
       <w:r>
         <w:rPr>
@@ -16,44 +15,44 @@
       </w:r>
     </w:p>
     <w:p>
-      <w:pPr>
-        <w:spacing w:line="360" w:lineRule="auto"/>
-        <w:jc w:val="both"/>
-      </w:pPr>
       <w:r>
-        <w:t>Template này dùng để export Pandoc với bảng có border liền, spacing chuẩn và font Times New Roman.</w:t>
+        <w:t>Template này dùng để export Pandoc với bảng căn giữa, border đậm và spacing 1.5 lines.</w:t>
       </w:r>
     </w:p>
     <w:tbl>
       <w:tblPr>
         <w:tblStyle w:val="TableGrid"/>
         <w:tblW w:w="0" w:type="auto"/>
+        <w:jc w:val="center"/>
         <w:tblBorders>
-          <w:top w:val="single" w:sz="12" w:space="0" w:color="auto"/>
-          <w:left w:val="single" w:sz="12" w:space="0" w:color="auto"/>
-          <w:bottom w:val="single" w:sz="12" w:space="0" w:color="auto"/>
-          <w:right w:val="single" w:sz="12" w:space="0" w:color="auto"/>
-          <w:insideH w:val="single" w:sz="12" w:space="0" w:color="auto"/>
-          <w:insideV w:val="single" w:sz="12" w:space="0" w:color="auto"/>
+          <w:top w:val="single" w:sz="16" w:space="0" w:color="000000"/>
+          <w:left w:val="single" w:sz="16" w:space="0" w:color="000000"/>
+          <w:bottom w:val="single" w:sz="16" w:space="0" w:color="000000"/>
+          <w:right w:val="single" w:sz="16" w:space="0" w:color="000000"/>
+          <w:insideH w:val="single" w:sz="16" w:space="0" w:color="000000"/>
+          <w:insideV w:val="single" w:sz="16" w:space="0" w:color="000000"/>
         </w:tblBorders>
         <w:tblLook w:val="04A0" w:firstRow="1" w:lastRow="0" w:firstColumn="1" w:lastColumn="0" w:noHBand="0" w:noVBand="1"/>
       </w:tblPr>
       <w:tblGrid>
-        <w:gridCol w:w="1990"/>
-        <w:gridCol w:w="1988"/>
-        <w:gridCol w:w="1988"/>
-        <w:gridCol w:w="1988"/>
-        <w:gridCol w:w="1988"/>
+        <w:gridCol w:w="1994"/>
+        <w:gridCol w:w="1994"/>
+        <w:gridCol w:w="1994"/>
+        <w:gridCol w:w="1994"/>
+        <w:gridCol w:w="1994"/>
       </w:tblGrid>
       <w:tr>
+        <w:trPr>
+          <w:jc w:val="center"/>
+        </w:trPr>
         <w:tc>
           <w:tcPr>
             <w:tcW w:w="1994" w:type="dxa"/>
+            <w:vAlign w:val="center"/>
           </w:tcPr>
           <w:p>
             <w:pPr>
-              <w:spacing w:line="360" w:lineRule="auto"/>
-              <w:jc w:val="both"/>
+              <w:jc w:val="center"/>
             </w:pPr>
             <w:r>
               <w:t>Tháng</w:t>
@@ -63,11 +62,11 @@
         <w:tc>
           <w:tcPr>
             <w:tcW w:w="1994" w:type="dxa"/>
+            <w:vAlign w:val="center"/>
           </w:tcPr>
           <w:p>
             <w:pPr>
-              <w:spacing w:line="360" w:lineRule="auto"/>
-              <w:jc w:val="both"/>
+              <w:jc w:val="center"/>
             </w:pPr>
             <w:r>
               <w:t>1</w:t>
@@ -77,11 +76,11 @@
         <w:tc>
           <w:tcPr>
             <w:tcW w:w="1994" w:type="dxa"/>
+            <w:vAlign w:val="center"/>
           </w:tcPr>
           <w:p>
             <w:pPr>
-              <w:spacing w:line="360" w:lineRule="auto"/>
-              <w:jc w:val="both"/>
+              <w:jc w:val="center"/>
             </w:pPr>
             <w:r>
               <w:t>2</w:t>
@@ -91,11 +90,11 @@
         <w:tc>
           <w:tcPr>
             <w:tcW w:w="1994" w:type="dxa"/>
+            <w:vAlign w:val="center"/>
           </w:tcPr>
           <w:p>
             <w:pPr>
-              <w:spacing w:line="360" w:lineRule="auto"/>
-              <w:jc w:val="both"/>
+              <w:jc w:val="center"/>
             </w:pPr>
             <w:r>
               <w:t>3</w:t>
@@ -105,11 +104,11 @@
         <w:tc>
           <w:tcPr>
             <w:tcW w:w="1994" w:type="dxa"/>
+            <w:vAlign w:val="center"/>
           </w:tcPr>
           <w:p>
             <w:pPr>
-              <w:spacing w:line="360" w:lineRule="auto"/>
-              <w:jc w:val="both"/>
+              <w:jc w:val="center"/>
             </w:pPr>
             <w:r>
               <w:t>4</w:t>
@@ -118,14 +117,17 @@
         </w:tc>
       </w:tr>
       <w:tr>
+        <w:trPr>
+          <w:jc w:val="center"/>
+        </w:trPr>
         <w:tc>
           <w:tcPr>
             <w:tcW w:w="1994" w:type="dxa"/>
+            <w:vAlign w:val="center"/>
           </w:tcPr>
           <w:p>
             <w:pPr>
-              <w:spacing w:line="360" w:lineRule="auto"/>
-              <w:jc w:val="both"/>
+              <w:jc w:val="center"/>
             </w:pPr>
             <w:r>
               <w:t>Hà Nội</w:t>
@@ -135,11 +137,11 @@
         <w:tc>
           <w:tcPr>
             <w:tcW w:w="1994" w:type="dxa"/>
+            <w:vAlign w:val="center"/>
           </w:tcPr>
           <w:p>
             <w:pPr>
-              <w:spacing w:line="360" w:lineRule="auto"/>
-              <w:jc w:val="both"/>
+              <w:jc w:val="center"/>
             </w:pPr>
             <w:r>
               <w:t>19</w:t>
@@ -149,11 +151,11 @@
         <w:tc>
           <w:tcPr>
             <w:tcW w:w="1994" w:type="dxa"/>
+            <w:vAlign w:val="center"/>
           </w:tcPr>
           <w:p>
             <w:pPr>
-              <w:spacing w:line="360" w:lineRule="auto"/>
-              <w:jc w:val="both"/>
+              <w:jc w:val="center"/>
             </w:pPr>
             <w:r>
               <w:t>26</w:t>
@@ -163,11 +165,11 @@
         <w:tc>
           <w:tcPr>
             <w:tcW w:w="1994" w:type="dxa"/>
+            <w:vAlign w:val="center"/>
           </w:tcPr>
           <w:p>
             <w:pPr>
-              <w:spacing w:line="360" w:lineRule="auto"/>
-              <w:jc w:val="both"/>
+              <w:jc w:val="center"/>
             </w:pPr>
             <w:r>
               <w:t>44</w:t>
@@ -177,11 +179,11 @@
         <w:tc>
           <w:tcPr>
             <w:tcW w:w="1994" w:type="dxa"/>
+            <w:vAlign w:val="center"/>
           </w:tcPr>
           <w:p>
             <w:pPr>
-              <w:spacing w:line="360" w:lineRule="auto"/>
-              <w:jc w:val="both"/>
+              <w:jc w:val="center"/>
             </w:pPr>
             <w:r>
               <w:t>90</w:t>
@@ -190,14 +192,17 @@
         </w:tc>
       </w:tr>
       <w:tr>
+        <w:trPr>
+          <w:jc w:val="center"/>
+        </w:trPr>
         <w:tc>
           <w:tcPr>
             <w:tcW w:w="1994" w:type="dxa"/>
+            <w:vAlign w:val="center"/>
           </w:tcPr>
           <w:p>
             <w:pPr>
-              <w:spacing w:line="360" w:lineRule="auto"/>
-              <w:jc w:val="both"/>
+              <w:jc w:val="center"/>
             </w:pPr>
             <w:r>
               <w:t>TP.HCM</w:t>
@@ -207,11 +212,11 @@
         <w:tc>
           <w:tcPr>
             <w:tcW w:w="1994" w:type="dxa"/>
+            <w:vAlign w:val="center"/>
           </w:tcPr>
           <w:p>
             <w:pPr>
-              <w:spacing w:line="360" w:lineRule="auto"/>
-              <w:jc w:val="both"/>
+              <w:jc w:val="center"/>
             </w:pPr>
             <w:r>
               <w:t>14</w:t>
@@ -221,11 +226,11 @@
         <w:tc>
           <w:tcPr>
             <w:tcW w:w="1994" w:type="dxa"/>
+            <w:vAlign w:val="center"/>
           </w:tcPr>
           <w:p>
             <w:pPr>
-              <w:spacing w:line="360" w:lineRule="auto"/>
-              <w:jc w:val="both"/>
+              <w:jc w:val="center"/>
             </w:pPr>
             <w:r>
               <w:t>4</w:t>
@@ -235,11 +240,11 @@
         <w:tc>
           <w:tcPr>
             <w:tcW w:w="1994" w:type="dxa"/>
+            <w:vAlign w:val="center"/>
           </w:tcPr>
           <w:p>
             <w:pPr>
-              <w:spacing w:line="360" w:lineRule="auto"/>
-              <w:jc w:val="both"/>
+              <w:jc w:val="center"/>
             </w:pPr>
             <w:r>
               <w:t>11</w:t>
@@ -249,11 +254,11 @@
         <w:tc>
           <w:tcPr>
             <w:tcW w:w="1994" w:type="dxa"/>
+            <w:vAlign w:val="center"/>
           </w:tcPr>
           <w:p>
             <w:pPr>
-              <w:spacing w:line="360" w:lineRule="auto"/>
-              <w:jc w:val="both"/>
+              <w:jc w:val="center"/>
             </w:pPr>
             <w:r>
               <w:t>50</w:t>
@@ -263,32 +268,24 @@
       </w:tr>
     </w:tbl>
     <w:p>
-      <w:pPr>
-        <w:spacing w:line="360" w:lineRule="auto"/>
-        <w:jc w:val="both"/>
-      </w:pPr>
       <w:r>
         <w:t>Dùng với lệnh:</w:t>
       </w:r>
     </w:p>
     <w:p>
-      <w:pPr>
-        <w:spacing w:line="360" w:lineRule="auto"/>
-        <w:jc w:val="both"/>
-      </w:pPr>
       <w:r>
         <w:rPr>
           <w:rFonts w:ascii="Courier New" w:hAnsi="Courier New"/>
           <w:b/>
+          <w:sz w:val="22"/>
         </w:rPr>
-        <w:t>pandoc input.md --reference-doc=template_pandoc.docx -o output.docx</w:t>
+        <w:t>pandoc input.md --reference-doc=template_pandoc_center.docx -o output.docx</w:t>
       </w:r>
     </w:p>
     <w:sectPr>
-      <w:headerReference w:type="default" r:id="rId8"/>
-      <w:footerReference w:type="default" r:id="rId9"/>
+      <w:footerReference w:type="default" r:id="rId8"/>
       <w:pgSz w:w="12240" w:h="15840"/>
-      <w:pgMar w:top="431" w:right="1134" w:bottom="1418" w:left="1134" w:header="720" w:footer="227" w:gutter="0"/>
+      <w:pgMar w:top="1134" w:right="1134" w:bottom="1134" w:left="1134" w:header="720" w:footer="222" w:gutter="0"/>
       <w:cols w:space="720"/>
       <w:docGrid w:linePitch="360"/>
     </w:sectPr>
@@ -300,6 +297,9 @@
 <w:endnotes xmlns:wpc="http://schemas.microsoft.com/office/word/2010/wordprocessingCanvas" xmlns:cx="http://schemas.microsoft.com/office/drawing/2014/chartex" xmlns:cx1="http://schemas.microsoft.com/office/drawing/2015/9/8/chartex" xmlns:cx2="http://schemas.microsoft.com/office/drawing/2015/10/21/chartex" xmlns:cx3="http://schemas.microsoft.com/office/drawing/2016/5/9/chartex" xmlns:cx4="http://schemas.microsoft.com/office/drawing/2016/5/10/chartex" xmlns:cx5="http://schemas.microsoft.com/office/drawing/2016/5/11/chartex" xmlns:cx6="http://schemas.microsoft.com/office/drawing/2016/5/12/chartex" xmlns:cx7="http://schemas.microsoft.com/office/drawing/2016/5/13/chartex" xmlns:cx8="http://schemas.microsoft.com/office/drawing/2016/5/14/chartex" xmlns:mc="http://schemas.openxmlformats.org/markup-compatibility/2006" xmlns:aink="http://schemas.microsoft.com/office/drawing/2016/ink" xmlns:am3d="http://schemas.microsoft.com/office/drawing/2017/model3d" xmlns:o="urn:schemas-microsoft-com:office:office" xmlns:oel="http://schemas.microsoft.com/office/2019/extlst" xmlns:r="http://schemas.openxmlformats.org/officeDocument/2006/relationships" xmlns:m="http://schemas.openxmlformats.org/officeDocument/2006/math" xmlns:v="urn:schemas-microsoft-com:vml" xmlns:wp14="http://schemas.microsoft.com/office/word/2010/wordprocessingDrawing" xmlns:wp="http://schemas.openxmlformats.org/drawingml/2006/wordprocessingDrawing" xmlns:w10="urn:schemas-microsoft-com:office:word" xmlns:w="http://schemas.openxmlformats.org/wordprocessingml/2006/main" xmlns:w14="http://schemas.microsoft.com/office/word/2010/wordml" xmlns:w15="http://schemas.microsoft.com/office/word/2012/wordml" xmlns:w16cex="http://schemas.microsoft.com/office/word/2018/wordml/cex" xmlns:w16cid="http://schemas.microsoft.com/office/word/2016/wordml/cid" xmlns:w16="http://schemas.microsoft.com/office/word/2018/wordml" xmlns:w16sdtdh="http://schemas.microsoft.com/office/word/2020/wordml/sdtdatahash" xmlns:w16se="http://schemas.microsoft.com/office/word/2015/wordml/symex" xmlns:wpg="http://schemas.microsoft.com/office/word/2010/wordprocessingGroup" xmlns:wpi="http://schemas.microsoft.com/office/word/2010/wordprocessingInk" xmlns:wne="http://schemas.microsoft.com/office/word/2006/wordml" xmlns:wps="http://schemas.microsoft.com/office/word/2010/wordprocessingShape" mc:Ignorable="w14 w15 w16se w16cid w16 w16cex w16sdtdh wp14">
   <w:endnote w:type="separator" w:id="-1">
     <w:p>
+      <w:pPr>
+        <w:spacing w:line="240" w:lineRule="auto"/>
+      </w:pPr>
       <w:r>
         <w:separator/>
       </w:r>
@@ -307,6 +307,9 @@
   </w:endnote>
   <w:endnote w:type="continuationSeparator" w:id="0">
     <w:p>
+      <w:pPr>
+        <w:spacing w:line="240" w:lineRule="auto"/>
+      </w:pPr>
       <w:r>
         <w:continuationSeparator/>
       </w:r>
@@ -319,7 +322,7 @@
 <w:ftr xmlns:wpc="http://schemas.microsoft.com/office/word/2010/wordprocessingCanvas" xmlns:cx="http://schemas.microsoft.com/office/drawing/2014/chartex" xmlns:cx1="http://schemas.microsoft.com/office/drawing/2015/9/8/chartex" xmlns:cx2="http://schemas.microsoft.com/office/drawing/2015/10/21/chartex" xmlns:cx3="http://schemas.microsoft.com/office/drawing/2016/5/9/chartex" xmlns:cx4="http://schemas.microsoft.com/office/drawing/2016/5/10/chartex" xmlns:cx5="http://schemas.microsoft.com/office/drawing/2016/5/11/chartex" xmlns:cx6="http://schemas.microsoft.com/office/drawing/2016/5/12/chartex" xmlns:cx7="http://schemas.microsoft.com/office/drawing/2016/5/13/chartex" xmlns:cx8="http://schemas.microsoft.com/office/drawing/2016/5/14/chartex" xmlns:mc="http://schemas.openxmlformats.org/markup-compatibility/2006" xmlns:aink="http://schemas.microsoft.com/office/drawing/2016/ink" xmlns:am3d="http://schemas.microsoft.com/office/drawing/2017/model3d" xmlns:o="urn:schemas-microsoft-com:office:office" xmlns:oel="http://schemas.microsoft.com/office/2019/extlst" xmlns:r="http://schemas.openxmlformats.org/officeDocument/2006/relationships" xmlns:m="http://schemas.openxmlformats.org/officeDocument/2006/math" xmlns:v="urn:schemas-microsoft-com:vml" xmlns:wp14="http://schemas.microsoft.com/office/word/2010/wordprocessingDrawing" xmlns:wp="http://schemas.openxmlformats.org/drawingml/2006/wordprocessingDrawing" xmlns:w10="urn:schemas-microsoft-com:office:word" xmlns:w="http://schemas.openxmlformats.org/wordprocessingml/2006/main" xmlns:w14="http://schemas.microsoft.com/office/word/2010/wordml" xmlns:w15="http://schemas.microsoft.com/office/word/2012/wordml" xmlns:w16cex="http://schemas.microsoft.com/office/word/2018/wordml/cex" xmlns:w16cid="http://schemas.microsoft.com/office/word/2016/wordml/cid" xmlns:w16="http://schemas.microsoft.com/office/word/2018/wordml" xmlns:w16sdtdh="http://schemas.microsoft.com/office/word/2020/wordml/sdtdatahash" xmlns:w16se="http://schemas.microsoft.com/office/word/2015/wordml/symex" xmlns:wpg="http://schemas.microsoft.com/office/word/2010/wordprocessingGroup" xmlns:wpi="http://schemas.microsoft.com/office/word/2010/wordprocessingInk" xmlns:wne="http://schemas.microsoft.com/office/word/2006/wordml" xmlns:wps="http://schemas.microsoft.com/office/word/2010/wordprocessingShape" mc:Ignorable="w14 w15 w16se w16cid w16 w16cex w16sdtdh wp14">
   <w:sdt>
     <w:sdtPr>
-      <w:id w:val="2049337779"/>
+      <w:id w:val="-870995126"/>
       <w:docPartObj>
         <w:docPartGallery w:val="Page Numbers (Bottom of Page)"/>
         <w:docPartUnique/>
@@ -372,6 +375,9 @@
 <w:footnotes xmlns:wpc="http://schemas.microsoft.com/office/word/2010/wordprocessingCanvas" xmlns:cx="http://schemas.microsoft.com/office/drawing/2014/chartex" xmlns:cx1="http://schemas.microsoft.com/office/drawing/2015/9/8/chartex" xmlns:cx2="http://schemas.microsoft.com/office/drawing/2015/10/21/chartex" xmlns:cx3="http://schemas.microsoft.com/office/drawing/2016/5/9/chartex" xmlns:cx4="http://schemas.microsoft.com/office/drawing/2016/5/10/chartex" xmlns:cx5="http://schemas.microsoft.com/office/drawing/2016/5/11/chartex" xmlns:cx6="http://schemas.microsoft.com/office/drawing/2016/5/12/chartex" xmlns:cx7="http://schemas.microsoft.com/office/drawing/2016/5/13/chartex" xmlns:cx8="http://schemas.microsoft.com/office/drawing/2016/5/14/chartex" xmlns:mc="http://schemas.openxmlformats.org/markup-compatibility/2006" xmlns:aink="http://schemas.microsoft.com/office/drawing/2016/ink" xmlns:am3d="http://schemas.microsoft.com/office/drawing/2017/model3d" xmlns:o="urn:schemas-microsoft-com:office:office" xmlns:oel="http://schemas.microsoft.com/office/2019/extlst" xmlns:r="http://schemas.openxmlformats.org/officeDocument/2006/relationships" xmlns:m="http://schemas.openxmlformats.org/officeDocument/2006/math" xmlns:v="urn:schemas-microsoft-com:vml" xmlns:wp14="http://schemas.microsoft.com/office/word/2010/wordprocessingDrawing" xmlns:wp="http://schemas.openxmlformats.org/drawingml/2006/wordprocessingDrawing" xmlns:w10="urn:schemas-microsoft-com:office:word" xmlns:w="http://schemas.openxmlformats.org/wordprocessingml/2006/main" xmlns:w14="http://schemas.microsoft.com/office/word/2010/wordml" xmlns:w15="http://schemas.microsoft.com/office/word/2012/wordml" xmlns:w16cex="http://schemas.microsoft.com/office/word/2018/wordml/cex" xmlns:w16cid="http://schemas.microsoft.com/office/word/2016/wordml/cid" xmlns:w16="http://schemas.microsoft.com/office/word/2018/wordml" xmlns:w16sdtdh="http://schemas.microsoft.com/office/word/2020/wordml/sdtdatahash" xmlns:w16se="http://schemas.microsoft.com/office/word/2015/wordml/symex" xmlns:wpg="http://schemas.microsoft.com/office/word/2010/wordprocessingGroup" xmlns:wpi="http://schemas.microsoft.com/office/word/2010/wordprocessingInk" xmlns:wne="http://schemas.microsoft.com/office/word/2006/wordml" xmlns:wps="http://schemas.microsoft.com/office/word/2010/wordprocessingShape" mc:Ignorable="w14 w15 w16se w16cid w16 w16cex w16sdtdh wp14">
   <w:footnote w:type="separator" w:id="-1">
     <w:p>
+      <w:pPr>
+        <w:spacing w:line="240" w:lineRule="auto"/>
+      </w:pPr>
       <w:r>
         <w:separator/>
       </w:r>
@@ -379,30 +385,15 @@
   </w:footnote>
   <w:footnote w:type="continuationSeparator" w:id="0">
     <w:p>
+      <w:pPr>
+        <w:spacing w:line="240" w:lineRule="auto"/>
+      </w:pPr>
       <w:r>
         <w:continuationSeparator/>
       </w:r>
     </w:p>
   </w:footnote>
 </w:footnotes>
-</file>
-
-<file path=word/header1.xml><?xml version="1.0" encoding="utf-8"?>
-<w:hdr xmlns:wpc="http://schemas.microsoft.com/office/word/2010/wordprocessingCanvas" xmlns:cx="http://schemas.microsoft.com/office/drawing/2014/chartex" xmlns:cx1="http://schemas.microsoft.com/office/drawing/2015/9/8/chartex" xmlns:cx2="http://schemas.microsoft.com/office/drawing/2015/10/21/chartex" xmlns:cx3="http://schemas.microsoft.com/office/drawing/2016/5/9/chartex" xmlns:cx4="http://schemas.microsoft.com/office/drawing/2016/5/10/chartex" xmlns:cx5="http://schemas.microsoft.com/office/drawing/2016/5/11/chartex" xmlns:cx6="http://schemas.microsoft.com/office/drawing/2016/5/12/chartex" xmlns:cx7="http://schemas.microsoft.com/office/drawing/2016/5/13/chartex" xmlns:cx8="http://schemas.microsoft.com/office/drawing/2016/5/14/chartex" xmlns:mc="http://schemas.openxmlformats.org/markup-compatibility/2006" xmlns:aink="http://schemas.microsoft.com/office/drawing/2016/ink" xmlns:am3d="http://schemas.microsoft.com/office/drawing/2017/model3d" xmlns:o="urn:schemas-microsoft-com:office:office" xmlns:oel="http://schemas.microsoft.com/office/2019/extlst" xmlns:r="http://schemas.openxmlformats.org/officeDocument/2006/relationships" xmlns:m="http://schemas.openxmlformats.org/officeDocument/2006/math" xmlns:v="urn:schemas-microsoft-com:vml" xmlns:wp14="http://schemas.microsoft.com/office/word/2010/wordprocessingDrawing" xmlns:wp="http://schemas.openxmlformats.org/drawingml/2006/wordprocessingDrawing" xmlns:w10="urn:schemas-microsoft-com:office:word" xmlns:w="http://schemas.openxmlformats.org/wordprocessingml/2006/main" xmlns:w14="http://schemas.microsoft.com/office/word/2010/wordml" xmlns:w15="http://schemas.microsoft.com/office/word/2012/wordml" xmlns:w16cex="http://schemas.microsoft.com/office/word/2018/wordml/cex" xmlns:w16cid="http://schemas.microsoft.com/office/word/2016/wordml/cid" xmlns:w16="http://schemas.microsoft.com/office/word/2018/wordml" xmlns:w16sdtdh="http://schemas.microsoft.com/office/word/2020/wordml/sdtdatahash" xmlns:w16se="http://schemas.microsoft.com/office/word/2015/wordml/symex" xmlns:wpg="http://schemas.microsoft.com/office/word/2010/wordprocessingGroup" xmlns:wpi="http://schemas.microsoft.com/office/word/2010/wordprocessingInk" xmlns:wne="http://schemas.microsoft.com/office/word/2006/wordml" xmlns:wps="http://schemas.microsoft.com/office/word/2010/wordprocessingShape" mc:Ignorable="w14 w15 w16se w16cid w16 w16cex w16sdtdh wp14">
-  <w:p>
-    <w:pPr>
-      <w:pStyle w:val="Header"/>
-      <w:tabs>
-        <w:tab w:val="clear" w:pos="4680"/>
-        <w:tab w:val="clear" w:pos="9360"/>
-        <w:tab w:val="left" w:pos="1328"/>
-      </w:tabs>
-    </w:pPr>
-    <w:r>
-      <w:tab/>
-    </w:r>
-  </w:p>
-</w:hdr>
 </file>
 
 <file path=word/numbering.xml><?xml version="1.0" encoding="utf-8"?>
@@ -578,31 +569,31 @@
       </w:rPr>
     </w:lvl>
   </w:abstractNum>
-  <w:num w:numId="1" w16cid:durableId="1981038864">
+  <w:num w:numId="1" w16cid:durableId="1664777927">
     <w:abstractNumId w:val="8"/>
   </w:num>
-  <w:num w:numId="2" w16cid:durableId="1851331312">
+  <w:num w:numId="2" w16cid:durableId="1252545432">
     <w:abstractNumId w:val="6"/>
   </w:num>
-  <w:num w:numId="3" w16cid:durableId="1086613481">
+  <w:num w:numId="3" w16cid:durableId="39718415">
     <w:abstractNumId w:val="5"/>
   </w:num>
-  <w:num w:numId="4" w16cid:durableId="765931105">
+  <w:num w:numId="4" w16cid:durableId="1766148660">
     <w:abstractNumId w:val="4"/>
   </w:num>
-  <w:num w:numId="5" w16cid:durableId="1793161725">
+  <w:num w:numId="5" w16cid:durableId="1086420261">
     <w:abstractNumId w:val="7"/>
   </w:num>
-  <w:num w:numId="6" w16cid:durableId="480004338">
+  <w:num w:numId="6" w16cid:durableId="1307903994">
     <w:abstractNumId w:val="3"/>
   </w:num>
-  <w:num w:numId="7" w16cid:durableId="1318340758">
+  <w:num w:numId="7" w16cid:durableId="1204246970">
     <w:abstractNumId w:val="2"/>
   </w:num>
-  <w:num w:numId="8" w16cid:durableId="1156654286">
+  <w:num w:numId="8" w16cid:durableId="278606194">
     <w:abstractNumId w:val="1"/>
   </w:num>
-  <w:num w:numId="9" w16cid:durableId="1756200831">
+  <w:num w:numId="9" w16cid:durableId="804465857">
     <w:abstractNumId w:val="0"/>
   </w:num>
 </w:numbering>
@@ -999,7 +990,7 @@
     <w:qFormat/>
     <w:rsid w:val="00FC693F"/>
     <w:pPr>
-      <w:spacing w:after="0" w:line="240" w:lineRule="auto"/>
+      <w:spacing w:after="0" w:line="360" w:lineRule="auto"/>
     </w:pPr>
     <w:rPr>
       <w:rFonts w:ascii="Times New Roman" w:hAnsi="Times New Roman"/>
@@ -1253,6 +1244,7 @@
         <w:tab w:val="center" w:pos="4680"/>
         <w:tab w:val="right" w:pos="9360"/>
       </w:tabs>
+      <w:spacing w:line="240" w:lineRule="auto"/>
     </w:pPr>
   </w:style>
   <w:style w:type="character" w:customStyle="1" w:styleId="HeaderChar">
@@ -1274,6 +1266,7 @@
         <w:tab w:val="center" w:pos="4680"/>
         <w:tab w:val="right" w:pos="9360"/>
       </w:tabs>
+      <w:spacing w:line="240" w:lineRule="auto"/>
     </w:pPr>
   </w:style>
   <w:style w:type="character" w:customStyle="1" w:styleId="FooterChar">
@@ -1347,7 +1340,7 @@
       <w:pBdr>
         <w:bottom w:val="single" w:sz="8" w:space="4" w:color="4F81BD" w:themeColor="accent1"/>
       </w:pBdr>
-      <w:spacing w:after="300"/>
+      <w:spacing w:after="300" w:line="240" w:lineRule="auto"/>
       <w:contextualSpacing/>
     </w:pPr>
     <w:rPr>
@@ -1789,6 +1782,9 @@
     <w:unhideWhenUsed/>
     <w:qFormat/>
     <w:rsid w:val="00FC693F"/>
+    <w:pPr>
+      <w:spacing w:line="240" w:lineRule="auto"/>
+    </w:pPr>
     <w:rPr>
       <w:b/>
       <w:bCs/>
@@ -1939,31 +1935,20 @@
     <w:name w:val="Table Grid"/>
     <w:basedOn w:val="TableNormal"/>
     <w:uiPriority w:val="59"/>
-    <w:rsid w:val="00C6156D"/>
+    <w:rsid w:val="00FC693F"/>
     <w:pPr>
       <w:spacing w:after="0" w:line="240" w:lineRule="auto"/>
     </w:pPr>
-    <w:rPr>
-      <w:rFonts w:ascii="Times New Roman" w:hAnsi="Times New Roman"/>
-      <w:sz w:val="26"/>
-    </w:rPr>
     <w:tblPr>
-      <w:jc w:val="center"/>
       <w:tblBorders>
-        <w:top w:val="single" w:sz="18" w:space="0" w:color="000000"/>
-        <w:left w:val="single" w:sz="18" w:space="0" w:color="000000"/>
-        <w:bottom w:val="single" w:sz="18" w:space="0" w:color="000000"/>
-        <w:right w:val="single" w:sz="18" w:space="0" w:color="000000"/>
-        <w:insideH w:val="single" w:sz="18" w:space="0" w:color="000000"/>
-        <w:insideV w:val="single" w:sz="18" w:space="0" w:color="000000"/>
+        <w:top w:val="single" w:sz="4" w:space="0" w:color="auto"/>
+        <w:left w:val="single" w:sz="4" w:space="0" w:color="auto"/>
+        <w:bottom w:val="single" w:sz="4" w:space="0" w:color="auto"/>
+        <w:right w:val="single" w:sz="4" w:space="0" w:color="auto"/>
+        <w:insideH w:val="single" w:sz="4" w:space="0" w:color="auto"/>
+        <w:insideV w:val="single" w:sz="4" w:space="0" w:color="auto"/>
       </w:tblBorders>
     </w:tblPr>
-    <w:trPr>
-      <w:jc w:val="center"/>
-    </w:trPr>
-    <w:tcPr>
-      <w:vAlign w:val="center"/>
-    </w:tcPr>
   </w:style>
   <w:style w:type="table" w:styleId="LightShading">
     <w:name w:val="Light Shading"/>

</xml_diff>

<commit_message>
Update: Latest revision of template_pandoc_center.docx
</commit_message>
<xml_diff>
--- a/reference.docx
+++ b/reference.docx
@@ -2,286 +2,7 @@
 <file path=word/document.xml><?xml version="1.0" encoding="utf-8"?>
 <w:document xmlns:wpc="http://schemas.microsoft.com/office/word/2010/wordprocessingCanvas" xmlns:cx="http://schemas.microsoft.com/office/drawing/2014/chartex" xmlns:cx1="http://schemas.microsoft.com/office/drawing/2015/9/8/chartex" xmlns:cx2="http://schemas.microsoft.com/office/drawing/2015/10/21/chartex" xmlns:cx3="http://schemas.microsoft.com/office/drawing/2016/5/9/chartex" xmlns:cx4="http://schemas.microsoft.com/office/drawing/2016/5/10/chartex" xmlns:cx5="http://schemas.microsoft.com/office/drawing/2016/5/11/chartex" xmlns:cx6="http://schemas.microsoft.com/office/drawing/2016/5/12/chartex" xmlns:cx7="http://schemas.microsoft.com/office/drawing/2016/5/13/chartex" xmlns:cx8="http://schemas.microsoft.com/office/drawing/2016/5/14/chartex" xmlns:mc="http://schemas.openxmlformats.org/markup-compatibility/2006" xmlns:aink="http://schemas.microsoft.com/office/drawing/2016/ink" xmlns:am3d="http://schemas.microsoft.com/office/drawing/2017/model3d" xmlns:o="urn:schemas-microsoft-com:office:office" xmlns:oel="http://schemas.microsoft.com/office/2019/extlst" xmlns:r="http://schemas.openxmlformats.org/officeDocument/2006/relationships" xmlns:m="http://schemas.openxmlformats.org/officeDocument/2006/math" xmlns:v="urn:schemas-microsoft-com:vml" xmlns:wp14="http://schemas.microsoft.com/office/word/2010/wordprocessingDrawing" xmlns:wp="http://schemas.openxmlformats.org/drawingml/2006/wordprocessingDrawing" xmlns:w10="urn:schemas-microsoft-com:office:word" xmlns:w="http://schemas.openxmlformats.org/wordprocessingml/2006/main" xmlns:w14="http://schemas.microsoft.com/office/word/2010/wordml" xmlns:w15="http://schemas.microsoft.com/office/word/2012/wordml" xmlns:w16cex="http://schemas.microsoft.com/office/word/2018/wordml/cex" xmlns:w16cid="http://schemas.microsoft.com/office/word/2016/wordml/cid" xmlns:w16="http://schemas.microsoft.com/office/word/2018/wordml" xmlns:w16sdtdh="http://schemas.microsoft.com/office/word/2020/wordml/sdtdatahash" xmlns:w16se="http://schemas.microsoft.com/office/word/2015/wordml/symex" xmlns:wpg="http://schemas.microsoft.com/office/word/2010/wordprocessingGroup" xmlns:wpi="http://schemas.microsoft.com/office/word/2010/wordprocessingInk" xmlns:wne="http://schemas.microsoft.com/office/word/2006/wordml" xmlns:wps="http://schemas.microsoft.com/office/word/2010/wordprocessingShape" mc:Ignorable="w14 w15 w16se w16cid w16 w16cex w16sdtdh wp14">
   <w:body>
-    <w:p>
-      <w:pPr>
-        <w:jc w:val="center"/>
-      </w:pPr>
-      <w:r>
-        <w:rPr>
-          <w:b/>
-          <w:sz w:val="32"/>
-        </w:rPr>
-        <w:t>TEMPLATE DOCX CHUẨN PANDOC</w:t>
-      </w:r>
-    </w:p>
-    <w:p>
-      <w:r>
-        <w:t>Template này dùng để export Pandoc với bảng căn giữa, border đậm và spacing 1.5 lines.</w:t>
-      </w:r>
-    </w:p>
-    <w:tbl>
-      <w:tblPr>
-        <w:tblStyle w:val="TableGrid"/>
-        <w:tblW w:w="0" w:type="auto"/>
-        <w:jc w:val="center"/>
-        <w:tblBorders>
-          <w:top w:val="single" w:sz="16" w:space="0" w:color="000000"/>
-          <w:left w:val="single" w:sz="16" w:space="0" w:color="000000"/>
-          <w:bottom w:val="single" w:sz="16" w:space="0" w:color="000000"/>
-          <w:right w:val="single" w:sz="16" w:space="0" w:color="000000"/>
-          <w:insideH w:val="single" w:sz="16" w:space="0" w:color="000000"/>
-          <w:insideV w:val="single" w:sz="16" w:space="0" w:color="000000"/>
-        </w:tblBorders>
-        <w:tblLook w:val="04A0" w:firstRow="1" w:lastRow="0" w:firstColumn="1" w:lastColumn="0" w:noHBand="0" w:noVBand="1"/>
-      </w:tblPr>
-      <w:tblGrid>
-        <w:gridCol w:w="1994"/>
-        <w:gridCol w:w="1994"/>
-        <w:gridCol w:w="1994"/>
-        <w:gridCol w:w="1994"/>
-        <w:gridCol w:w="1994"/>
-      </w:tblGrid>
-      <w:tr>
-        <w:trPr>
-          <w:jc w:val="center"/>
-        </w:trPr>
-        <w:tc>
-          <w:tcPr>
-            <w:tcW w:w="1994" w:type="dxa"/>
-            <w:vAlign w:val="center"/>
-          </w:tcPr>
-          <w:p>
-            <w:pPr>
-              <w:jc w:val="center"/>
-            </w:pPr>
-            <w:r>
-              <w:t>Tháng</w:t>
-            </w:r>
-          </w:p>
-        </w:tc>
-        <w:tc>
-          <w:tcPr>
-            <w:tcW w:w="1994" w:type="dxa"/>
-            <w:vAlign w:val="center"/>
-          </w:tcPr>
-          <w:p>
-            <w:pPr>
-              <w:jc w:val="center"/>
-            </w:pPr>
-            <w:r>
-              <w:t>1</w:t>
-            </w:r>
-          </w:p>
-        </w:tc>
-        <w:tc>
-          <w:tcPr>
-            <w:tcW w:w="1994" w:type="dxa"/>
-            <w:vAlign w:val="center"/>
-          </w:tcPr>
-          <w:p>
-            <w:pPr>
-              <w:jc w:val="center"/>
-            </w:pPr>
-            <w:r>
-              <w:t>2</w:t>
-            </w:r>
-          </w:p>
-        </w:tc>
-        <w:tc>
-          <w:tcPr>
-            <w:tcW w:w="1994" w:type="dxa"/>
-            <w:vAlign w:val="center"/>
-          </w:tcPr>
-          <w:p>
-            <w:pPr>
-              <w:jc w:val="center"/>
-            </w:pPr>
-            <w:r>
-              <w:t>3</w:t>
-            </w:r>
-          </w:p>
-        </w:tc>
-        <w:tc>
-          <w:tcPr>
-            <w:tcW w:w="1994" w:type="dxa"/>
-            <w:vAlign w:val="center"/>
-          </w:tcPr>
-          <w:p>
-            <w:pPr>
-              <w:jc w:val="center"/>
-            </w:pPr>
-            <w:r>
-              <w:t>4</w:t>
-            </w:r>
-          </w:p>
-        </w:tc>
-      </w:tr>
-      <w:tr>
-        <w:trPr>
-          <w:jc w:val="center"/>
-        </w:trPr>
-        <w:tc>
-          <w:tcPr>
-            <w:tcW w:w="1994" w:type="dxa"/>
-            <w:vAlign w:val="center"/>
-          </w:tcPr>
-          <w:p>
-            <w:pPr>
-              <w:jc w:val="center"/>
-            </w:pPr>
-            <w:r>
-              <w:t>Hà Nội</w:t>
-            </w:r>
-          </w:p>
-        </w:tc>
-        <w:tc>
-          <w:tcPr>
-            <w:tcW w:w="1994" w:type="dxa"/>
-            <w:vAlign w:val="center"/>
-          </w:tcPr>
-          <w:p>
-            <w:pPr>
-              <w:jc w:val="center"/>
-            </w:pPr>
-            <w:r>
-              <w:t>19</w:t>
-            </w:r>
-          </w:p>
-        </w:tc>
-        <w:tc>
-          <w:tcPr>
-            <w:tcW w:w="1994" w:type="dxa"/>
-            <w:vAlign w:val="center"/>
-          </w:tcPr>
-          <w:p>
-            <w:pPr>
-              <w:jc w:val="center"/>
-            </w:pPr>
-            <w:r>
-              <w:t>26</w:t>
-            </w:r>
-          </w:p>
-        </w:tc>
-        <w:tc>
-          <w:tcPr>
-            <w:tcW w:w="1994" w:type="dxa"/>
-            <w:vAlign w:val="center"/>
-          </w:tcPr>
-          <w:p>
-            <w:pPr>
-              <w:jc w:val="center"/>
-            </w:pPr>
-            <w:r>
-              <w:t>44</w:t>
-            </w:r>
-          </w:p>
-        </w:tc>
-        <w:tc>
-          <w:tcPr>
-            <w:tcW w:w="1994" w:type="dxa"/>
-            <w:vAlign w:val="center"/>
-          </w:tcPr>
-          <w:p>
-            <w:pPr>
-              <w:jc w:val="center"/>
-            </w:pPr>
-            <w:r>
-              <w:t>90</w:t>
-            </w:r>
-          </w:p>
-        </w:tc>
-      </w:tr>
-      <w:tr>
-        <w:trPr>
-          <w:jc w:val="center"/>
-        </w:trPr>
-        <w:tc>
-          <w:tcPr>
-            <w:tcW w:w="1994" w:type="dxa"/>
-            <w:vAlign w:val="center"/>
-          </w:tcPr>
-          <w:p>
-            <w:pPr>
-              <w:jc w:val="center"/>
-            </w:pPr>
-            <w:r>
-              <w:t>TP.HCM</w:t>
-            </w:r>
-          </w:p>
-        </w:tc>
-        <w:tc>
-          <w:tcPr>
-            <w:tcW w:w="1994" w:type="dxa"/>
-            <w:vAlign w:val="center"/>
-          </w:tcPr>
-          <w:p>
-            <w:pPr>
-              <w:jc w:val="center"/>
-            </w:pPr>
-            <w:r>
-              <w:t>14</w:t>
-            </w:r>
-          </w:p>
-        </w:tc>
-        <w:tc>
-          <w:tcPr>
-            <w:tcW w:w="1994" w:type="dxa"/>
-            <w:vAlign w:val="center"/>
-          </w:tcPr>
-          <w:p>
-            <w:pPr>
-              <w:jc w:val="center"/>
-            </w:pPr>
-            <w:r>
-              <w:t>4</w:t>
-            </w:r>
-          </w:p>
-        </w:tc>
-        <w:tc>
-          <w:tcPr>
-            <w:tcW w:w="1994" w:type="dxa"/>
-            <w:vAlign w:val="center"/>
-          </w:tcPr>
-          <w:p>
-            <w:pPr>
-              <w:jc w:val="center"/>
-            </w:pPr>
-            <w:r>
-              <w:t>11</w:t>
-            </w:r>
-          </w:p>
-        </w:tc>
-        <w:tc>
-          <w:tcPr>
-            <w:tcW w:w="1994" w:type="dxa"/>
-            <w:vAlign w:val="center"/>
-          </w:tcPr>
-          <w:p>
-            <w:pPr>
-              <w:jc w:val="center"/>
-            </w:pPr>
-            <w:r>
-              <w:t>50</w:t>
-            </w:r>
-          </w:p>
-        </w:tc>
-      </w:tr>
-    </w:tbl>
-    <w:p>
-      <w:r>
-        <w:t>Dùng với lệnh:</w:t>
-      </w:r>
-    </w:p>
-    <w:p>
-      <w:r>
-        <w:rPr>
-          <w:rFonts w:ascii="Courier New" w:hAnsi="Courier New"/>
-          <w:b/>
-          <w:sz w:val="22"/>
-        </w:rPr>
-        <w:t>pandoc input.md --reference-doc=template_pandoc_center.docx -o output.docx</w:t>
-      </w:r>
-    </w:p>
+    <w:p/>
     <w:sectPr>
       <w:footerReference w:type="default" r:id="rId8"/>
       <w:pgSz w:w="12240" w:h="15840"/>
@@ -1935,20 +1656,31 @@
     <w:name w:val="Table Grid"/>
     <w:basedOn w:val="TableNormal"/>
     <w:uiPriority w:val="59"/>
-    <w:rsid w:val="00FC693F"/>
+    <w:rsid w:val="002C2027"/>
     <w:pPr>
       <w:spacing w:after="0" w:line="240" w:lineRule="auto"/>
     </w:pPr>
+    <w:rPr>
+      <w:rFonts w:ascii="Times New Roman" w:hAnsi="Times New Roman"/>
+      <w:sz w:val="26"/>
+    </w:rPr>
     <w:tblPr>
+      <w:jc w:val="center"/>
       <w:tblBorders>
-        <w:top w:val="single" w:sz="4" w:space="0" w:color="auto"/>
-        <w:left w:val="single" w:sz="4" w:space="0" w:color="auto"/>
-        <w:bottom w:val="single" w:sz="4" w:space="0" w:color="auto"/>
-        <w:right w:val="single" w:sz="4" w:space="0" w:color="auto"/>
-        <w:insideH w:val="single" w:sz="4" w:space="0" w:color="auto"/>
-        <w:insideV w:val="single" w:sz="4" w:space="0" w:color="auto"/>
+        <w:top w:val="single" w:sz="18" w:space="0" w:color="auto"/>
+        <w:left w:val="single" w:sz="18" w:space="0" w:color="auto"/>
+        <w:bottom w:val="single" w:sz="18" w:space="0" w:color="auto"/>
+        <w:right w:val="single" w:sz="18" w:space="0" w:color="auto"/>
+        <w:insideH w:val="single" w:sz="18" w:space="0" w:color="auto"/>
+        <w:insideV w:val="single" w:sz="18" w:space="0" w:color="auto"/>
       </w:tblBorders>
     </w:tblPr>
+    <w:trPr>
+      <w:jc w:val="center"/>
+    </w:trPr>
+    <w:tcPr>
+      <w:vAlign w:val="center"/>
+    </w:tcPr>
   </w:style>
   <w:style w:type="table" w:styleId="LightShading">
     <w:name w:val="Light Shading"/>
@@ -11984,6 +11716,36 @@
         <w:shd w:val="clear" w:color="auto" w:fill="FBCAA2" w:themeFill="accent6" w:themeFillTint="7F"/>
       </w:tcPr>
     </w:tblStylePr>
+  </w:style>
+  <w:style w:type="table" w:customStyle="1" w:styleId="Style1">
+    <w:name w:val="Style1"/>
+    <w:basedOn w:val="TableNormal"/>
+    <w:uiPriority w:val="99"/>
+    <w:rsid w:val="002C2027"/>
+    <w:pPr>
+      <w:spacing w:after="0" w:line="240" w:lineRule="auto"/>
+    </w:pPr>
+    <w:rPr>
+      <w:rFonts w:ascii="Times New Roman" w:hAnsi="Times New Roman"/>
+      <w:sz w:val="26"/>
+    </w:rPr>
+    <w:tblPr>
+      <w:jc w:val="center"/>
+      <w:tblBorders>
+        <w:top w:val="single" w:sz="18" w:space="0" w:color="000000"/>
+        <w:left w:val="single" w:sz="18" w:space="0" w:color="000000"/>
+        <w:bottom w:val="single" w:sz="18" w:space="0" w:color="000000"/>
+        <w:right w:val="single" w:sz="18" w:space="0" w:color="000000"/>
+        <w:insideH w:val="single" w:sz="18" w:space="0" w:color="000000"/>
+        <w:insideV w:val="single" w:sz="18" w:space="0" w:color="000000"/>
+      </w:tblBorders>
+    </w:tblPr>
+    <w:trPr>
+      <w:jc w:val="center"/>
+    </w:trPr>
+    <w:tcPr>
+      <w:vAlign w:val="center"/>
+    </w:tcPr>
   </w:style>
 </w:styles>
 </file>

</xml_diff>